<commit_message>
20260720: Fix generated sheet artifact xmlns:r (LibreOffice rejected the unbound prefix), dedupe AY suffix in PDF filename
</commit_message>
<xml_diff>
--- a/domain/operation/outcome_matrix/document/grade-sheet-template-academic.docx
+++ b/domain/operation/outcome_matrix/document/grade-sheet-template-academic.docx
@@ -1,5 +1,299 @@
 
-<file path=word/document.xml><?xml version="1.0" encoding="UTF-8" standalone="yes"?><w:document xmlns:w="http://schemas.openxmlformats.org/wordprocessingml/2006/main"><w:body><w:p><w:pPr><w:spacing w:after="60"/><w:jc w:val="center"/></w:pPr><w:r><w:rPr><w:b/><w:sz w:val="32"/><w:szCs w:val="32"/></w:rPr><w:t xml:space="preserve">{{sheet_title}}</w:t></w:r></w:p><w:p><w:pPr><w:spacing w:after="200"/><w:jc w:val="center"/></w:pPr><w:r><w:rPr><w:b/><w:sz w:val="22"/><w:szCs w:val="22"/></w:rPr><w:t xml:space="preserve">{{section_name}}</w:t></w:r><w:r><w:rPr><w:sz w:val="22"/><w:szCs w:val="22"/></w:rPr><w:t xml:space="preserve">   </w:t></w:r><w:r><w:rPr><w:sz w:val="22"/><w:szCs w:val="22"/></w:rPr><w:t xml:space="preserve">{{academic_year}}</w:t></w:r></w:p><w:tbl><w:tblPr><w:tblW w:w="9972" w:type="dxa"/><w:tblLayout w:type="fixed"/><w:tblBorders><w:top w:val="single" w:sz="4" w:space="0" w:color="000000"/><w:left w:val="single" w:sz="4" w:space="0" w:color="000000"/><w:bottom w:val="single" w:sz="4" w:space="0" w:color="000000"/><w:right w:val="single" w:sz="4" w:space="0" w:color="000000"/><w:insideH w:val="single" w:sz="4" w:space="0" w:color="000000"/><w:insideV w:val="single" w:sz="4" w:space="0" w:color="000000"/></w:tblBorders><w:tblCellMar><w:left w:w="72" w:type="dxa"/><w:right w:w="72" w:type="dxa"/></w:tblCellMar></w:tblPr><w:tblGrid><w:gridCol w:w="3990"/><w:gridCol w:w="1994"/><w:gridCol w:w="1994"/><w:gridCol w:w="1994"/></w:tblGrid><w:tr><w:trPr><w:cantSplit/><w:trHeight w:val="340" w:hRule="atLeast"/></w:trPr><w:tc><w:tcPr><w:tcW w:w="3990" w:type="dxa"/><w:shd w:val="clear" w:color="auto" w:fill="C00000"/><w:vAlign w:val="center"/></w:tcPr><w:p><w:pPr><w:keepNext/><w:spacing w:after="0"/><w:jc w:val="left"/></w:pPr><w:r><w:rPr><w:b/><w:color w:val="FFFFFF"/><w:sz w:val="18"/><w:szCs w:val="18"/></w:rPr><w:t xml:space="preserve">{{name_label}}</w:t></w:r></w:p></w:tc><w:tc><w:tcPr><w:tcW w:w="1994" w:type="dxa"/><w:shd w:val="clear" w:color="auto" w:fill="C00000"/><w:vAlign w:val="center"/></w:tcPr><w:p><w:pPr><w:keepNext/><w:spacing w:after="0"/><w:jc w:val="center"/></w:pPr><w:r><w:rPr><w:b/><w:color w:val="FFFFFF"/><w:sz w:val="18"/><w:szCs w:val="18"/></w:rPr><w:t xml:space="preserve">{{period1_label}}</w:t></w:r></w:p></w:tc><w:tc><w:tcPr><w:tcW w:w="1994" w:type="dxa"/><w:shd w:val="clear" w:color="auto" w:fill="C00000"/><w:vAlign w:val="center"/></w:tcPr><w:p><w:pPr><w:keepNext/><w:spacing w:after="0"/><w:jc w:val="center"/></w:pPr><w:r><w:rPr><w:b/><w:color w:val="FFFFFF"/><w:sz w:val="18"/><w:szCs w:val="18"/></w:rPr><w:t xml:space="preserve">{{period2_label}}</w:t></w:r></w:p></w:tc><w:tc><w:tcPr><w:tcW w:w="1994" w:type="dxa"/><w:shd w:val="clear" w:color="auto" w:fill="C00000"/><w:vAlign w:val="center"/></w:tcPr><w:p><w:pPr><w:keepNext/><w:spacing w:after="0"/><w:jc w:val="center"/></w:pPr><w:r><w:rPr><w:b/><w:color w:val="FFFFFF"/><w:sz w:val="18"/><w:szCs w:val="18"/></w:rPr><w:t xml:space="preserve">{{final_label}}</w:t></w:r></w:p></w:tc></w:tr><w:tr><w:trPr><w:cantSplit/></w:trPr><w:tc><w:tcPr><w:tcW w:w="9972" w:type="dxa"/><w:vAlign w:val="center"/></w:tcPr><w:p><w:pPr><w:spacing w:after="0"/></w:pPr><w:r><w:t xml:space="preserve">{{#students}}</w:t></w:r></w:p></w:tc></w:tr><w:tr><w:trPr><w:cantSplit/><w:trHeight w:val="300" w:hRule="atLeast"/></w:trPr><w:tc><w:tcPr><w:tcW w:w="3990" w:type="dxa"/><w:vAlign w:val="center"/></w:tcPr><w:p><w:pPr><w:spacing w:after="0"/><w:jc w:val="left"/></w:pPr><w:r><w:rPr><w:sz w:val="18"/><w:szCs w:val="18"/></w:rPr><w:t xml:space="preserve">{{name}}</w:t></w:r></w:p></w:tc><w:tc><w:tcPr><w:tcW w:w="1994" w:type="dxa"/><w:vAlign w:val="center"/></w:tcPr><w:p><w:pPr><w:spacing w:after="0"/><w:jc w:val="center"/></w:pPr><w:r><w:rPr><w:sz w:val="18"/><w:szCs w:val="18"/></w:rPr><w:t xml:space="preserve">{{period1}}</w:t></w:r></w:p></w:tc><w:tc><w:tcPr><w:tcW w:w="1994" w:type="dxa"/><w:vAlign w:val="center"/></w:tcPr><w:p><w:pPr><w:spacing w:after="0"/><w:jc w:val="center"/></w:pPr><w:r><w:rPr><w:sz w:val="18"/><w:szCs w:val="18"/></w:rPr><w:t xml:space="preserve">{{period2}}</w:t></w:r></w:p></w:tc><w:tc><w:tcPr><w:tcW w:w="1994" w:type="dxa"/><w:vAlign w:val="center"/></w:tcPr><w:p><w:pPr><w:spacing w:after="0"/><w:jc w:val="center"/></w:pPr><w:r><w:rPr><w:sz w:val="18"/><w:szCs w:val="18"/></w:rPr><w:t xml:space="preserve">{{final}}</w:t></w:r></w:p></w:tc></w:tr><w:tr><w:trPr><w:cantSplit/></w:trPr><w:tc><w:tcPr><w:tcW w:w="9972" w:type="dxa"/><w:vAlign w:val="center"/></w:tcPr><w:p><w:pPr><w:spacing w:after="0"/></w:pPr><w:r><w:t xml:space="preserve">{{/students}}</w:t></w:r></w:p></w:tc></w:tr></w:tbl><w:sectPr><w:footerReference w:type="default" r:id="rId201"/><w:footerReference w:type="first" r:id="rId201"/><w:pgSz w:w="12240" w:h="15840"/><w:pgMar w:top="1134" w:right="1134" w:bottom="1134" w:left="1134" w:header="720" w:footer="480" w:gutter="0"/></w:sectPr></w:body></w:document>
+<file path=word/document.xml><?xml version="1.0" encoding="utf-8"?>
+<w:document xmlns:w="http://schemas.openxmlformats.org/wordprocessingml/2006/main" xmlns:r="http://schemas.openxmlformats.org/officeDocument/2006/relationships">
+  <w:body>
+    <w:p>
+      <w:pPr>
+        <w:spacing w:after="60"/>
+        <w:jc w:val="center"/>
+      </w:pPr>
+      <w:r>
+        <w:rPr>
+          <w:b/>
+          <w:sz w:val="32"/>
+          <w:szCs w:val="32"/>
+        </w:rPr>
+        <w:t xml:space="preserve">{{sheet_title}}</w:t>
+      </w:r>
+    </w:p>
+    <w:p>
+      <w:pPr>
+        <w:spacing w:after="200"/>
+        <w:jc w:val="center"/>
+      </w:pPr>
+      <w:r>
+        <w:rPr>
+          <w:b/>
+          <w:sz w:val="22"/>
+          <w:szCs w:val="22"/>
+        </w:rPr>
+        <w:t xml:space="preserve">{{section_name}}</w:t>
+      </w:r>
+      <w:r>
+        <w:rPr>
+          <w:sz w:val="22"/>
+          <w:szCs w:val="22"/>
+        </w:rPr>
+        <w:t xml:space="preserve">   </w:t>
+      </w:r>
+      <w:r>
+        <w:rPr>
+          <w:sz w:val="22"/>
+          <w:szCs w:val="22"/>
+        </w:rPr>
+        <w:t xml:space="preserve">{{academic_year}}</w:t>
+      </w:r>
+    </w:p>
+    <w:tbl>
+      <w:tblPr>
+        <w:tblW w:w="9972" w:type="dxa"/>
+        <w:tblLayout w:type="fixed"/>
+        <w:tblBorders>
+          <w:top w:val="single" w:sz="4" w:space="0" w:color="000000"/>
+          <w:left w:val="single" w:sz="4" w:space="0" w:color="000000"/>
+          <w:bottom w:val="single" w:sz="4" w:space="0" w:color="000000"/>
+          <w:right w:val="single" w:sz="4" w:space="0" w:color="000000"/>
+          <w:insideH w:val="single" w:sz="4" w:space="0" w:color="000000"/>
+          <w:insideV w:val="single" w:sz="4" w:space="0" w:color="000000"/>
+        </w:tblBorders>
+        <w:tblCellMar>
+          <w:left w:w="72" w:type="dxa"/>
+          <w:right w:w="72" w:type="dxa"/>
+        </w:tblCellMar>
+      </w:tblPr>
+      <w:tblGrid>
+        <w:gridCol w:w="3990"/>
+        <w:gridCol w:w="1994"/>
+        <w:gridCol w:w="1994"/>
+        <w:gridCol w:w="1994"/>
+      </w:tblGrid>
+      <w:tr>
+        <w:trPr>
+          <w:cantSplit/>
+          <w:trHeight w:val="340" w:hRule="atLeast"/>
+        </w:trPr>
+        <w:tc>
+          <w:tcPr>
+            <w:tcW w:w="3990" w:type="dxa"/>
+            <w:shd w:val="clear" w:color="auto" w:fill="C00000"/>
+            <w:vAlign w:val="center"/>
+          </w:tcPr>
+          <w:p>
+            <w:pPr>
+              <w:keepNext/>
+              <w:spacing w:after="0"/>
+              <w:jc w:val="left"/>
+            </w:pPr>
+            <w:r>
+              <w:rPr>
+                <w:b/>
+                <w:color w:val="FFFFFF"/>
+                <w:sz w:val="18"/>
+                <w:szCs w:val="18"/>
+              </w:rPr>
+              <w:t xml:space="preserve">{{name_label}}</w:t>
+            </w:r>
+          </w:p>
+        </w:tc>
+        <w:tc>
+          <w:tcPr>
+            <w:tcW w:w="1994" w:type="dxa"/>
+            <w:shd w:val="clear" w:color="auto" w:fill="C00000"/>
+            <w:vAlign w:val="center"/>
+          </w:tcPr>
+          <w:p>
+            <w:pPr>
+              <w:keepNext/>
+              <w:spacing w:after="0"/>
+              <w:jc w:val="center"/>
+            </w:pPr>
+            <w:r>
+              <w:rPr>
+                <w:b/>
+                <w:color w:val="FFFFFF"/>
+                <w:sz w:val="18"/>
+                <w:szCs w:val="18"/>
+              </w:rPr>
+              <w:t xml:space="preserve">{{period1_label}}</w:t>
+            </w:r>
+          </w:p>
+        </w:tc>
+        <w:tc>
+          <w:tcPr>
+            <w:tcW w:w="1994" w:type="dxa"/>
+            <w:shd w:val="clear" w:color="auto" w:fill="C00000"/>
+            <w:vAlign w:val="center"/>
+          </w:tcPr>
+          <w:p>
+            <w:pPr>
+              <w:keepNext/>
+              <w:spacing w:after="0"/>
+              <w:jc w:val="center"/>
+            </w:pPr>
+            <w:r>
+              <w:rPr>
+                <w:b/>
+                <w:color w:val="FFFFFF"/>
+                <w:sz w:val="18"/>
+                <w:szCs w:val="18"/>
+              </w:rPr>
+              <w:t xml:space="preserve">{{period2_label}}</w:t>
+            </w:r>
+          </w:p>
+        </w:tc>
+        <w:tc>
+          <w:tcPr>
+            <w:tcW w:w="1994" w:type="dxa"/>
+            <w:shd w:val="clear" w:color="auto" w:fill="C00000"/>
+            <w:vAlign w:val="center"/>
+          </w:tcPr>
+          <w:p>
+            <w:pPr>
+              <w:keepNext/>
+              <w:spacing w:after="0"/>
+              <w:jc w:val="center"/>
+            </w:pPr>
+            <w:r>
+              <w:rPr>
+                <w:b/>
+                <w:color w:val="FFFFFF"/>
+                <w:sz w:val="18"/>
+                <w:szCs w:val="18"/>
+              </w:rPr>
+              <w:t xml:space="preserve">{{final_label}}</w:t>
+            </w:r>
+          </w:p>
+        </w:tc>
+      </w:tr>
+      <w:tr>
+        <w:trPr>
+          <w:cantSplit/>
+        </w:trPr>
+        <w:tc>
+          <w:tcPr>
+            <w:tcW w:w="9972" w:type="dxa"/>
+            <w:vAlign w:val="center"/>
+          </w:tcPr>
+          <w:p>
+            <w:pPr>
+              <w:spacing w:after="0"/>
+            </w:pPr>
+            <w:r>
+              <w:t xml:space="preserve">{{#students}}</w:t>
+            </w:r>
+          </w:p>
+        </w:tc>
+      </w:tr>
+      <w:tr>
+        <w:trPr>
+          <w:cantSplit/>
+          <w:trHeight w:val="300" w:hRule="atLeast"/>
+        </w:trPr>
+        <w:tc>
+          <w:tcPr>
+            <w:tcW w:w="3990" w:type="dxa"/>
+            <w:vAlign w:val="center"/>
+          </w:tcPr>
+          <w:p>
+            <w:pPr>
+              <w:spacing w:after="0"/>
+              <w:jc w:val="left"/>
+            </w:pPr>
+            <w:r>
+              <w:rPr>
+                <w:sz w:val="18"/>
+                <w:szCs w:val="18"/>
+              </w:rPr>
+              <w:t xml:space="preserve">{{name}}</w:t>
+            </w:r>
+          </w:p>
+        </w:tc>
+        <w:tc>
+          <w:tcPr>
+            <w:tcW w:w="1994" w:type="dxa"/>
+            <w:vAlign w:val="center"/>
+          </w:tcPr>
+          <w:p>
+            <w:pPr>
+              <w:spacing w:after="0"/>
+              <w:jc w:val="center"/>
+            </w:pPr>
+            <w:r>
+              <w:rPr>
+                <w:sz w:val="18"/>
+                <w:szCs w:val="18"/>
+              </w:rPr>
+              <w:t xml:space="preserve">{{period1}}</w:t>
+            </w:r>
+          </w:p>
+        </w:tc>
+        <w:tc>
+          <w:tcPr>
+            <w:tcW w:w="1994" w:type="dxa"/>
+            <w:vAlign w:val="center"/>
+          </w:tcPr>
+          <w:p>
+            <w:pPr>
+              <w:spacing w:after="0"/>
+              <w:jc w:val="center"/>
+            </w:pPr>
+            <w:r>
+              <w:rPr>
+                <w:sz w:val="18"/>
+                <w:szCs w:val="18"/>
+              </w:rPr>
+              <w:t xml:space="preserve">{{period2}}</w:t>
+            </w:r>
+          </w:p>
+        </w:tc>
+        <w:tc>
+          <w:tcPr>
+            <w:tcW w:w="1994" w:type="dxa"/>
+            <w:vAlign w:val="center"/>
+          </w:tcPr>
+          <w:p>
+            <w:pPr>
+              <w:spacing w:after="0"/>
+              <w:jc w:val="center"/>
+            </w:pPr>
+            <w:r>
+              <w:rPr>
+                <w:sz w:val="18"/>
+                <w:szCs w:val="18"/>
+              </w:rPr>
+              <w:t xml:space="preserve">{{final}}</w:t>
+            </w:r>
+          </w:p>
+        </w:tc>
+      </w:tr>
+      <w:tr>
+        <w:trPr>
+          <w:cantSplit/>
+        </w:trPr>
+        <w:tc>
+          <w:tcPr>
+            <w:tcW w:w="9972" w:type="dxa"/>
+            <w:vAlign w:val="center"/>
+          </w:tcPr>
+          <w:p>
+            <w:pPr>
+              <w:spacing w:after="0"/>
+            </w:pPr>
+            <w:r>
+              <w:t xml:space="preserve">{{/students}}</w:t>
+            </w:r>
+          </w:p>
+        </w:tc>
+      </w:tr>
+    </w:tbl>
+    <w:sectPr>
+      <w:footerReference w:type="default" r:id="rId201"/>
+      <w:footerReference w:type="first" r:id="rId201"/>
+      <w:pgSz w:w="12240" w:h="15840"/>
+      <w:pgMar w:top="1134" w:right="1134" w:bottom="1134" w:left="1134" w:header="720" w:footer="480" w:gutter="0"/>
+    </w:sectPr>
+  </w:body>
+</w:document>
 </file>
 
 <file path=word/footer1.xml><?xml version="1.0" encoding="utf-8"?>

</xml_diff>